<commit_message>
fix: Nadia actualiza rol Asesor en Manual Matriculados Secundario — puede modificar y completar datos
</commit_message>
<xml_diff>
--- a/public/manuales/Manual_Matriculados_Secundario_2026.docx
+++ b/public/manuales/Manual_Matriculados_Secundario_2026.docx
@@ -579,7 +579,7 @@
           <w:sz w:val="20"/>
           <w:szCs w:val="20"/>
         </w:rPr>
-        <w:t xml:space="preserve">El módulo Matriculados centraliza la gestión académico-administrativa del estudiante: su legajo, el seguimiento de regularidad, los pases y el historial de movimientos. Como asesor, tu rol es de lectura y acompañamiento — no podés modificar datos directamente.</w:t>
+        <w:t xml:space="preserve">El módulo Matriculados centraliza la gestión académico-administrativa del estudiante: su legajo, el seguimiento de regularidad, los pases y el historial de movimientos. Como asesor, podés consultar y gestionar la información de los establecimientos asignados, y modificar o completar datos cuando el establecimiento lo solicita.</w:t>
       </w:r>
     </w:p>
     <w:tbl>
@@ -1136,7 +1136,7 @@
                 <w:sz w:val="18"/>
                 <w:szCs w:val="18"/>
               </w:rPr>
-              <w:t xml:space="preserve">Acceso de lectura a los establecimientos asignados. No puede modificar datos.</w:t>
+              <w:t xml:space="preserve">Puede consultar y gestionar información de los establecimientos asignados. Puede modificar y completar datos cuando el establecimiento lo solicita.</w:t>
             </w:r>
           </w:p>
         </w:tc>
@@ -1969,7 +1969,7 @@
           <w:sz w:val="20"/>
           <w:szCs w:val="20"/>
         </w:rPr>
-        <w:t xml:space="preserve">Como asesor, podés consultar la información sin modificarla. Las acciones disponibles desde la lista principal son:</w:t>
+        <w:t xml:space="preserve">Como asesor, podés consultar y gestionar la información de los establecimientos asignados. Las acciones disponibles desde la lista principal son:</w:t>
       </w:r>
     </w:p>
     <w:tbl>
@@ -2239,7 +2239,7 @@
           <w:sz w:val="20"/>
           <w:szCs w:val="20"/>
         </w:rPr>
-        <w:t xml:space="preserve">Al abrir el legajo de un estudiante, encontrás distintas solapas que organizan su información. El asesor tiene acceso de lectura a todas ellas.</w:t>
+        <w:t xml:space="preserve">Al abrir el legajo de un estudiante, encontrás distintas solapas que organizan su información. El asesor puede consultar y gestionar todas ellas.</w:t>
       </w:r>
     </w:p>
     <w:p>

</xml_diff>